<commit_message>
Fiderana Iso BNI et tabeau dynamique
</commit_message>
<xml_diff>
--- a/apptab/Canvas Virements.docx
+++ b/apptab/Canvas Virements.docx
@@ -185,12 +185,10 @@
           </w:tcPr>
           <w:p>
             <w:proofErr w:type="spellStart"/>
-            <w:proofErr w:type="gramStart"/>
             <w:r>
               <w:t>mtnt</w:t>
             </w:r>
             <w:proofErr w:type="spellEnd"/>
-            <w:proofErr w:type="gramEnd"/>
           </w:p>
         </w:tc>
       </w:tr>
@@ -211,12 +209,10 @@
           </w:tcPr>
           <w:p>
             <w:proofErr w:type="spellStart"/>
-            <w:proofErr w:type="gramStart"/>
             <w:r>
               <w:t>dateDem</w:t>
             </w:r>
             <w:proofErr w:type="spellEnd"/>
-            <w:proofErr w:type="gramEnd"/>
           </w:p>
         </w:tc>
       </w:tr>
@@ -315,161 +311,15 @@
             <w:tcW w:w="6799" w:type="dxa"/>
           </w:tcPr>
           <w:p>
-            <w:proofErr w:type="gramStart"/>
             <w:r>
               <w:t>libelle</w:t>
             </w:r>
-            <w:proofErr w:type="gramEnd"/>
           </w:p>
         </w:tc>
       </w:tr>
       <w:bookmarkEnd w:id="0"/>
     </w:tbl>
     <w:p/>
-    <w:p/>
-    <w:tbl>
-      <w:tblPr>
-        <w:tblStyle w:val="Grilledutableau"/>
-        <w:tblW w:w="0" w:type="auto"/>
-        <w:tblLook w:val="04A0" w:firstRow="1" w:lastRow="0" w:firstColumn="1" w:lastColumn="0" w:noHBand="0" w:noVBand="1"/>
-      </w:tblPr>
-      <w:tblGrid>
-        <w:gridCol w:w="2263"/>
-        <w:gridCol w:w="6799"/>
-      </w:tblGrid>
-      <w:tr>
-        <w:tc>
-          <w:tcPr>
-            <w:tcW w:w="9062" w:type="dxa"/>
-            <w:gridSpan w:val="2"/>
-          </w:tcPr>
-          <w:p>
-            <w:pPr>
-              <w:spacing w:after="160" w:line="259" w:lineRule="auto"/>
-              <w:jc w:val="center"/>
-            </w:pPr>
-            <w:r>
-              <w:t>BENEFICIAIRE A CREDITER</w:t>
-            </w:r>
-          </w:p>
-        </w:tc>
-      </w:tr>
-      <w:tr>
-        <w:tc>
-          <w:tcPr>
-            <w:tcW w:w="2263" w:type="dxa"/>
-          </w:tcPr>
-          <w:p>
-            <w:pPr>
-              <w:spacing w:after="160" w:line="259" w:lineRule="auto"/>
-            </w:pPr>
-            <w:r>
-              <w:t>Compte</w:t>
-            </w:r>
-          </w:p>
-        </w:tc>
-        <w:tc>
-          <w:tcPr>
-            <w:tcW w:w="6799" w:type="dxa"/>
-          </w:tcPr>
-          <w:p>
-            <w:pPr>
-              <w:spacing w:after="160" w:line="259" w:lineRule="auto"/>
-            </w:pPr>
-            <w:proofErr w:type="spellStart"/>
-            <w:r>
-              <w:t>CompteCredit</w:t>
-            </w:r>
-            <w:proofErr w:type="spellEnd"/>
-          </w:p>
-        </w:tc>
-      </w:tr>
-      <w:tr>
-        <w:tc>
-          <w:tcPr>
-            <w:tcW w:w="2263" w:type="dxa"/>
-          </w:tcPr>
-          <w:p>
-            <w:r>
-              <w:t>Bénéficiaire</w:t>
-            </w:r>
-          </w:p>
-        </w:tc>
-        <w:tc>
-          <w:tcPr>
-            <w:tcW w:w="6799" w:type="dxa"/>
-          </w:tcPr>
-          <w:p>
-            <w:proofErr w:type="spellStart"/>
-            <w:r>
-              <w:t>BeneficiaireUCP</w:t>
-            </w:r>
-            <w:proofErr w:type="spellEnd"/>
-          </w:p>
-        </w:tc>
-      </w:tr>
-      <w:tr>
-        <w:tc>
-          <w:tcPr>
-            <w:tcW w:w="2263" w:type="dxa"/>
-          </w:tcPr>
-          <w:p>
-            <w:pPr>
-              <w:spacing w:after="160" w:line="259" w:lineRule="auto"/>
-            </w:pPr>
-            <w:r>
-              <w:t>Motif</w:t>
-            </w:r>
-          </w:p>
-        </w:tc>
-        <w:tc>
-          <w:tcPr>
-            <w:tcW w:w="6799" w:type="dxa"/>
-          </w:tcPr>
-          <w:p>
-            <w:pPr>
-              <w:spacing w:after="160" w:line="259" w:lineRule="auto"/>
-            </w:pPr>
-            <w:proofErr w:type="spellStart"/>
-            <w:proofErr w:type="gramStart"/>
-            <w:r>
-              <w:t>motifcredit</w:t>
-            </w:r>
-            <w:proofErr w:type="spellEnd"/>
-            <w:proofErr w:type="gramEnd"/>
-          </w:p>
-        </w:tc>
-      </w:tr>
-      <w:tr>
-        <w:trPr>
-          <w:trHeight w:val="396"/>
-        </w:trPr>
-        <w:tc>
-          <w:tcPr>
-            <w:tcW w:w="2263" w:type="dxa"/>
-          </w:tcPr>
-          <w:p>
-            <w:r>
-              <w:t>Référence</w:t>
-            </w:r>
-          </w:p>
-        </w:tc>
-        <w:tc>
-          <w:tcPr>
-            <w:tcW w:w="6799" w:type="dxa"/>
-          </w:tcPr>
-          <w:p>
-            <w:proofErr w:type="spellStart"/>
-            <w:proofErr w:type="gramStart"/>
-            <w:r>
-              <w:t>referenceCredit</w:t>
-            </w:r>
-            <w:proofErr w:type="spellEnd"/>
-            <w:proofErr w:type="gramEnd"/>
-          </w:p>
-        </w:tc>
-      </w:tr>
-    </w:tbl>
     <w:p/>
     <w:sectPr>
       <w:pgSz w:w="11906" w:h="16838"/>

</xml_diff>